<commit_message>
Finalize reproducibility and rubric compliance
</commit_message>
<xml_diff>
--- a/Statistical_Analysis_Report.docx
+++ b/Statistical_Analysis_Report.docx
@@ -78,22 +78,14 @@
         <w:ind w:firstLine="720"/>
       </w:pPr>
       <w:r>
-        <w:rPr>
-          <w:i w:val="0"/>
-        </w:rPr>
-        <w:t>This project analyzes five complete California fiscal years of public-sector procurement records to identify patterns relevant to ICM Solutions staffing and business-development planning. The analysis integrates closed bids from California Cal eProcure, the County of El Dorado PlanetBids portal, and the City of Sacramento PlanetBids portal, then separately applies the same screening rules to a current/open-bid snapshot. The central statistical question is whether the broad mix of ICM-relevant staffing demand differs by fiscal quarter.</w:t>
+        <w:t>This project analyzes the California Multi-Jurisdiction Public Procurement Dataset, an integrated collection of five complete fiscal years of closed bids from California Cal eProcure (https://caleprocure.ca.gov/), the County of El Dorado PlanetBids portal (https://vendors.planetbids.com/portal/48157/bo/bo-search), and the City of Sacramento PlanetBids portal (https://vendors.planetbids.com/portal/15300/bo/bo-search). It evaluates patterns relevant to ICM Solutions' staffing and business-development planning and separately applies the same screening rules to a current/open-bid snapshot. The central statistical question is whether the broad mix of ICM-relevant staffing demand differs by fiscal quarter. The analysis uses reproducible data ingestion, descriptive statistics, four visual models, a chi-square hypothesis test, and effect-size interpretation; it does not train a machine-learning model.</w:t>
       </w:r>
     </w:p>
     <w:p>
       <w:pPr>
         <w:ind w:firstLine="720"/>
       </w:pPr>
-      <w:r>
-        <w:rPr>
-          <w:i w:val="0"/>
-        </w:rPr>
-        <w:t>The work is positioned as a procurement-intelligence component of ICM Solutions broader AI-enabled public-sector consulting intelligence and assurance concept. It does not train a machine-learning model. Instead, it uses reproducible data ingestion, descriptive statistics, visual models, a chi-square hypothesis test, and effect-size interpretation to convert public bid data into a cautious workforce-planning signal.</w:t>
-      </w:r>
+      <w:r/>
     </w:p>
     <w:p>
       <w:pPr>
@@ -110,22 +102,14 @@
         <w:ind w:firstLine="720"/>
       </w:pPr>
       <w:r>
-        <w:rPr>
-          <w:i w:val="0"/>
-        </w:rPr>
-        <w:t>The historical analytical dataset contains 29,646 procurement records with due dates from July 1, 2021 through June 30, 2026. It includes 28,107 California state records, 1,227 City of Sacramento records, and 312 El Dorado County records. The original source schemas were harmonized into common fields for source portal, jurisdiction, agency, solicitation ID, title, due date, status, fiscal year, and fiscal quarter. Derived fields include a composite record key, normalized status, title-based ICM relevance, detailed service category, and broad staffing-demand family.</w:t>
+        <w:t>The historical analytical dataset contains 29,646 rows and 24 standardized analytical columns with due dates from July 1, 2021 through June 30, 2026. It includes 28,107 California state records, 1,227 City of Sacramento records, and 312 El Dorado County records. Key variables include source portal, jurisdiction, agency, solicitation ID, title, due date, status, fiscal year, fiscal quarter, title-based ICM relevance, detailed service category, and broad staffing-demand family. The source schemas were harmonized into common fields, and a composite record key and normalized classifications were derived for analysis. The Cal eProcure exports use an .xls filename but contain an HTML table, while the PlanetBids records are UTF-8 CSV exports; all original files are preserved and the notebook writes a standardized CSV and data dictionary.</w:t>
       </w:r>
     </w:p>
     <w:p>
       <w:pPr>
         <w:ind w:firstLine="720"/>
       </w:pPr>
-      <w:r>
-        <w:rPr>
-          <w:i w:val="0"/>
-        </w:rPr>
-        <w:t>The data were downloaded from the California Cal eProcure public portal, the County of El Dorado PlanetBids public portal, and the City of Sacramento PlanetBids public portal. The Cal eProcure exports use an .xls filename but contain an HTML table, so the notebook loads them with pandas.read_html(). PlanetBids records are loaded from UTF-8 CSV exports. All raw files are preserved in the submission, and the notebook writes a standardized CSV and data dictionary for reproducibility.</w:t>
-      </w:r>
+      <w:r/>
     </w:p>
     <w:p>
       <w:pPr>
@@ -569,10 +553,7 @@
         <w:ind w:firstLine="720"/>
       </w:pPr>
       <w:r>
-        <w:rPr>
-          <w:i w:val="0"/>
-        </w:rPr>
-        <w:t>Frequency counts and proportions summarized categorical variables. Monthly counts and three-month rolling averages represented timing. Wilson 95% confidence intervals were calculated for jurisdiction-level screening rates because the city and county sources were much smaller than the state source. Four visual models were created: monthly relevant-bid volume, relevant rate by jurisdiction, staffing-family composition by fiscal quarter, and detailed service-category counts. The models were compared based on the business question each supports and the information each hides.</w:t>
+        <w:t>Frequency counts and proportions summarized categorical variables. Monthly counts and three-month rolling averages represented timing. Wilson 95% confidence intervals were calculated for jurisdiction-level screening rates to display uncertainty in binomial proportions, particularly for the smaller city and county samples (Wilson, 1927). Four visual models were created: monthly relevant-bid volume, relevant rate by jurisdiction, staffing-family composition by fiscal quarter, and detailed service-category counts. The models were compared based on the business question each supports and the information each hides.</w:t>
       </w:r>
     </w:p>
     <w:p>
@@ -2096,6 +2077,24 @@
         <w:t>McHugh, M. L. (2013). The chi-square test of independence. Biochemia Medica, 23(2), 143-149. https://doi.org/10.11613/BM.2013.018</w:t>
       </w:r>
     </w:p>
+    <w:p>
+      <w:pPr>
+        <w:spacing w:line="480" w:lineRule="auto"/>
+        <w:ind w:left="720" w:hanging="720"/>
+      </w:pPr>
+      <w:r>
+        <w:t xml:space="preserve">Wilson, E. B. (1927). Probable inference, the law of succession, and statistical inference. </w:t>
+      </w:r>
+      <w:r>
+        <w:rPr>
+          <w:i/>
+        </w:rPr>
+        <w:t>Journal of the American Statistical Association, 22</w:t>
+      </w:r>
+      <w:r>
+        <w:t>(158), 209-212. https://doi.org/10.1080/01621459.1927.10502953</w:t>
+      </w:r>
+    </w:p>
     <w:sectPr>
       <w:headerReference w:type="default" r:id="rId9"/>
       <w:pgSz w:w="12240" w:h="15840"/>

</xml_diff>